<commit_message>
Add Martabe WIs batch 9 (tailings pH probe check, raw and filtrate water)
Co-Authored-By: Claude Sonnet 5.5 <noreply@anthropic.com>
Claude-Session: https://claude.ai/code/session_0121qocWgsZdFAsne2oz9sHT
</commit_message>
<xml_diff>
--- a/SWI/201-Plant-Sampling/MM-4034-033-OR-03-SWI-PRO-MET-201-019-Water-Treatment-Plant-Feed-and-Discharge-Sampling-RevA.docx
+++ b/SWI/201-Plant-Sampling/MM-4034-033-OR-03-SWI-PRO-MET-201-019-Water-Treatment-Plant-Feed-and-Discharge-Sampling-RevA.docx
@@ -638,7 +638,7 @@
                 <w:sz w:val="17"/>
                 <w:szCs w:val="17"/>
               </w:rPr>
-              <w:t xml:space="preserve">ISSUED BUT NOT FOR USE. This document is a placeholder against the register line so the line is not empty. It cannot be used until the named input arrives - see the folder README for the blocker and what closes it.</w:t>
+              <w:t xml:space="preserve">ISSUED BUT NOT FOR USE. Part A (water treatment plant No. 1 and No. 2 feed and discharge) still cannot be completed - the circuit narrative is missing, see the folder README. Part B is a Martabe water-filter sampling technique from 'Sampling Raw and Filtrat Water' (DOC-3-MET-PRS-WIN-00063-IE), added as a draft technique reference only. It is for a potable water filter, not for the discharge that carries the licence obligation.</w:t>
             </w:r>
           </w:p>
         </w:tc>
@@ -1331,6 +1331,58 @@
           </w:p>
         </w:tc>
       </w:tr>
+      <w:tr>
+        <w:tc>
+          <w:tcPr>
+            <w:tcW w:type="dxa" w:w="2900"/>
+            <w:shd w:val="clear" w:color="auto" w:fill="F2F5FA"/>
+            <w:tcMar>
+              <w:top w:type="dxa" w:w="55"/>
+              <w:left w:type="dxa" w:w="85"/>
+              <w:bottom w:type="dxa" w:w="55"/>
+              <w:right w:type="dxa" w:w="85"/>
+            </w:tcMar>
+          </w:tcPr>
+          <w:p>
+            <w:pPr>
+              <w:spacing w:after="0" w:line="235"/>
+            </w:pPr>
+            <w:r>
+              <w:rPr>
+                <w:rFonts w:ascii="Calibri" w:cs="Calibri" w:eastAsia="Calibri" w:hAnsi="Calibri"/>
+                <w:sz w:val="16"/>
+                <w:szCs w:val="16"/>
+              </w:rPr>
+              <w:t xml:space="preserve">[JSEA to confirm] Water splash, wet floor and overhead pipes at a water filter sampling point</w:t>
+            </w:r>
+          </w:p>
+        </w:tc>
+        <w:tc>
+          <w:tcPr>
+            <w:tcW w:type="dxa" w:w="6126"/>
+            <w:shd w:val="clear" w:color="auto" w:fill="F2F5FA"/>
+            <w:tcMar>
+              <w:top w:type="dxa" w:w="55"/>
+              <w:left w:type="dxa" w:w="85"/>
+              <w:bottom w:type="dxa" w:w="55"/>
+              <w:right w:type="dxa" w:w="85"/>
+            </w:tcMar>
+          </w:tcPr>
+          <w:p>
+            <w:pPr>
+              <w:spacing w:after="0" w:line="235"/>
+            </w:pPr>
+            <w:r>
+              <w:rPr>
+                <w:rFonts w:ascii="Calibri" w:cs="Calibri" w:eastAsia="Calibri" w:hAnsi="Calibri"/>
+                <w:sz w:val="16"/>
+                <w:szCs w:val="16"/>
+              </w:rPr>
+              <w:t xml:space="preserve">Latex gloves, glasses, hard hat and safety boots. Watch footing on wet floors. Watch overhead pipes and keep the hard hat on. Hold the bottle directly under the outflow.</w:t>
+            </w:r>
+          </w:p>
+        </w:tc>
+      </w:tr>
     </w:tbl>
     <w:p>
       <w:pPr>
@@ -1755,6 +1807,23 @@
     </w:p>
     <w:p>
       <w:pPr>
+        <w:spacing w:after="90" w:before="180" w:line="245"/>
+        <w:keepNext/>
+      </w:pPr>
+      <w:r>
+        <w:rPr>
+          <w:rFonts w:ascii="Calibri" w:cs="Calibri" w:eastAsia="Calibri" w:hAnsi="Calibri"/>
+          <w:b/>
+          <w:bCs/>
+          <w:color w:val="1F3864"/>
+          <w:sz w:val="19"/>
+          <w:szCs w:val="19"/>
+        </w:rPr>
+        <w:t xml:space="preserve">Part A - Water treatment plant No. 1 and No. 2 feed and discharge</w:t>
+      </w:r>
+    </w:p>
+    <w:p>
+      <w:pPr>
         <w:ind w:left="280"/>
         <w:spacing w:after="50" w:before="0" w:line="245"/>
       </w:pPr>
@@ -1799,6 +1868,217 @@
           <w:szCs w:val="17"/>
         </w:rPr>
         <w:t xml:space="preserve">  The document is issued so the register line is not empty, and is marked NOT FOR USE.</w:t>
+      </w:r>
+    </w:p>
+    <w:p>
+      <w:pPr>
+        <w:spacing w:after="90" w:before="180" w:line="245"/>
+        <w:keepNext/>
+      </w:pPr>
+      <w:r>
+        <w:rPr>
+          <w:rFonts w:ascii="Calibri" w:cs="Calibri" w:eastAsia="Calibri" w:hAnsi="Calibri"/>
+          <w:b/>
+          <w:bCs/>
+          <w:color w:val="1F3864"/>
+          <w:sz w:val="19"/>
+          <w:szCs w:val="19"/>
+        </w:rPr>
+        <w:t xml:space="preserve">Part B - Raw and filtrate water sampling technique at a water filter [M]</w:t>
+      </w:r>
+    </w:p>
+    <w:p>
+      <w:pPr>
+        <w:spacing w:after="60" w:before="0" w:line="245"/>
+      </w:pPr>
+      <w:r>
+        <w:rPr>
+          <w:rFonts w:ascii="Calibri" w:cs="Calibri" w:eastAsia="Calibri" w:hAnsi="Calibri"/>
+          <w:sz w:val="17"/>
+          <w:szCs w:val="17"/>
+        </w:rPr>
+        <w:t xml:space="preserve">[M] = taken from the Martabe team work instruction "Sampling Raw and Filtrat Water (DOC-3-MET-PRS-WIN-00063-IE)" (25/12/2024). [CONFIRM] = unspecified or inconsistent in the source; resolve before this instruction is approved for use.</w:t>
+      </w:r>
+    </w:p>
+    <w:p>
+      <w:pPr>
+        <w:spacing w:after="60" w:before="0" w:line="245"/>
+      </w:pPr>
+      <w:r>
+        <w:rPr>
+          <w:rFonts w:ascii="Calibri" w:cs="Calibri" w:eastAsia="Calibri" w:hAnsi="Calibri"/>
+          <w:sz w:val="17"/>
+          <w:szCs w:val="17"/>
+        </w:rPr>
+        <w:t xml:space="preserve">[CONFIRM] the source is for the Martabe potable water filter (raw water in, filtrate out), not for water treatment plant No. 1 or No. 2 feed and discharge. 'SLS' and the assay suite are not defined. Use it only as a sampling technique until the circuit narrative arrives. Cyanide-bearing water needs the Section 3 controls, not this part alone.</w:t>
+      </w:r>
+    </w:p>
+    <w:p>
+      <w:pPr>
+        <w:ind w:left="280"/>
+        <w:spacing w:after="50" w:before="0" w:line="245"/>
+      </w:pPr>
+      <w:r>
+        <w:rPr>
+          <w:rFonts w:ascii="Calibri" w:cs="Calibri" w:eastAsia="Calibri" w:hAnsi="Calibri"/>
+          <w:b/>
+          <w:bCs/>
+          <w:sz w:val="17"/>
+          <w:szCs w:val="17"/>
+        </w:rPr>
+        <w:t xml:space="preserve">3.</w:t>
+      </w:r>
+      <w:r>
+        <w:rPr>
+          <w:rFonts w:ascii="Calibri" w:cs="Calibri" w:eastAsia="Calibri" w:hAnsi="Calibri"/>
+          <w:sz w:val="17"/>
+          <w:szCs w:val="17"/>
+        </w:rPr>
+        <w:t xml:space="preserve">  Take 5 minutes before starting ('Take 5'). Prepare 1 L sample bottles. Make sure the filter plant is running in its filtration sequence [M].</w:t>
+      </w:r>
+    </w:p>
+    <w:p>
+      <w:pPr>
+        <w:ind w:left="280"/>
+        <w:spacing w:after="50" w:before="0" w:line="245"/>
+      </w:pPr>
+      <w:r>
+        <w:rPr>
+          <w:rFonts w:ascii="Calibri" w:cs="Calibri" w:eastAsia="Calibri" w:hAnsi="Calibri"/>
+          <w:b/>
+          <w:bCs/>
+          <w:sz w:val="17"/>
+          <w:szCs w:val="17"/>
+        </w:rPr>
+        <w:t xml:space="preserve">4.</w:t>
+      </w:r>
+      <w:r>
+        <w:rPr>
+          <w:rFonts w:ascii="Calibri" w:cs="Calibri" w:eastAsia="Calibri" w:hAnsi="Calibri"/>
+          <w:sz w:val="17"/>
+          <w:szCs w:val="17"/>
+        </w:rPr>
+        <w:t xml:space="preserve">  Raw (input) water: the sampling point is next to the vertical SLS ladder. Stand so you are not under the sampling point.</w:t>
+      </w:r>
+    </w:p>
+    <w:p>
+      <w:pPr>
+        <w:ind w:left="280"/>
+        <w:spacing w:after="50" w:before="0" w:line="245"/>
+      </w:pPr>
+      <w:r>
+        <w:rPr>
+          <w:rFonts w:ascii="Calibri" w:cs="Calibri" w:eastAsia="Calibri" w:hAnsi="Calibri"/>
+          <w:b/>
+          <w:bCs/>
+          <w:sz w:val="17"/>
+          <w:szCs w:val="17"/>
+        </w:rPr>
+        <w:t xml:space="preserve">5.</w:t>
+      </w:r>
+      <w:r>
+        <w:rPr>
+          <w:rFonts w:ascii="Calibri" w:cs="Calibri" w:eastAsia="Calibri" w:hAnsi="Calibri"/>
+          <w:sz w:val="17"/>
+          <w:szCs w:val="17"/>
+        </w:rPr>
+        <w:t xml:space="preserve">  Open the tap upward slowly and wait about 30 to 60 seconds so the sample is representative. Rinse the bottle with raw water.</w:t>
+      </w:r>
+    </w:p>
+    <w:p>
+      <w:pPr>
+        <w:ind w:left="280"/>
+        <w:spacing w:after="50" w:before="0" w:line="245"/>
+      </w:pPr>
+      <w:r>
+        <w:rPr>
+          <w:rFonts w:ascii="Calibri" w:cs="Calibri" w:eastAsia="Calibri" w:hAnsi="Calibri"/>
+          <w:b/>
+          <w:bCs/>
+          <w:sz w:val="17"/>
+          <w:szCs w:val="17"/>
+        </w:rPr>
+        <w:t xml:space="preserve">6.</w:t>
+      </w:r>
+      <w:r>
+        <w:rPr>
+          <w:rFonts w:ascii="Calibri" w:cs="Calibri" w:eastAsia="Calibri" w:hAnsi="Calibri"/>
+          <w:sz w:val="17"/>
+          <w:szCs w:val="17"/>
+        </w:rPr>
+        <w:t xml:space="preserve">  Hold the bottle right under the outflow and wait until it is full. Collect at least 900 mL.</w:t>
+      </w:r>
+    </w:p>
+    <w:p>
+      <w:pPr>
+        <w:ind w:left="280"/>
+        <w:spacing w:after="50" w:before="0" w:line="245"/>
+      </w:pPr>
+      <w:r>
+        <w:rPr>
+          <w:rFonts w:ascii="Calibri" w:cs="Calibri" w:eastAsia="Calibri" w:hAnsi="Calibri"/>
+          <w:b/>
+          <w:bCs/>
+          <w:sz w:val="17"/>
+          <w:szCs w:val="17"/>
+        </w:rPr>
+        <w:t xml:space="preserve">7.</w:t>
+      </w:r>
+      <w:r>
+        <w:rPr>
+          <w:rFonts w:ascii="Calibri" w:cs="Calibri" w:eastAsia="Calibri" w:hAnsi="Calibri"/>
+          <w:sz w:val="17"/>
+          <w:szCs w:val="17"/>
+        </w:rPr>
+        <w:t xml:space="preserve">  Close the tap downward. Make sure no water is still coming out of the tap.</w:t>
+      </w:r>
+    </w:p>
+    <w:p>
+      <w:pPr>
+        <w:ind w:left="280"/>
+        <w:spacing w:after="50" w:before="0" w:line="245"/>
+      </w:pPr>
+      <w:r>
+        <w:rPr>
+          <w:rFonts w:ascii="Calibri" w:cs="Calibri" w:eastAsia="Calibri" w:hAnsi="Calibri"/>
+          <w:b/>
+          <w:bCs/>
+          <w:sz w:val="17"/>
+          <w:szCs w:val="17"/>
+        </w:rPr>
+        <w:t xml:space="preserve">8.</w:t>
+      </w:r>
+      <w:r>
+        <w:rPr>
+          <w:rFonts w:ascii="Calibri" w:cs="Calibri" w:eastAsia="Calibri" w:hAnsi="Calibri"/>
+          <w:sz w:val="17"/>
+          <w:szCs w:val="17"/>
+        </w:rPr>
+        <w:t xml:space="preserve">  Filtrate water: the sampling point is below the raw water point. Take the sample with the same steps.</w:t>
+      </w:r>
+    </w:p>
+    <w:p>
+      <w:pPr>
+        <w:ind w:left="280"/>
+        <w:spacing w:after="50" w:before="0" w:line="245"/>
+      </w:pPr>
+      <w:r>
+        <w:rPr>
+          <w:rFonts w:ascii="Calibri" w:cs="Calibri" w:eastAsia="Calibri" w:hAnsi="Calibri"/>
+          <w:b/>
+          <w:bCs/>
+          <w:sz w:val="17"/>
+          <w:szCs w:val="17"/>
+        </w:rPr>
+        <w:t xml:space="preserve">9.</w:t>
+      </w:r>
+      <w:r>
+        <w:rPr>
+          <w:rFonts w:ascii="Calibri" w:cs="Calibri" w:eastAsia="Calibri" w:hAnsi="Calibri"/>
+          <w:sz w:val="17"/>
+          <w:szCs w:val="17"/>
+        </w:rPr>
+        <w:t xml:space="preserve">  Send the samples to the laboratory for assay (the source says ITS) and record the result in 'G:\Processing\5. Metallurgy\Metallurgy\34. Water\Assay sample Potable Water Final.xlsb'.</w:t>
       </w:r>
     </w:p>
     <w:p>
@@ -2030,6 +2310,24 @@
           <w:szCs w:val="17"/>
         </w:rPr>
         <w:t xml:space="preserve">No source held</w:t>
+      </w:r>
+    </w:p>
+    <w:p>
+      <w:pPr>
+        <w:pStyle w:val="ListParagraph"/>
+        <w:numPr>
+          <w:ilvl w:val="0"/>
+          <w:numId w:val="1"/>
+        </w:numPr>
+        <w:spacing w:after="60" w:line="245"/>
+      </w:pPr>
+      <w:r>
+        <w:rPr>
+          <w:rFonts w:ascii="Calibri" w:cs="Calibri" w:eastAsia="Calibri" w:hAnsi="Calibri"/>
+          <w:sz w:val="17"/>
+          <w:szCs w:val="17"/>
+        </w:rPr>
+        <w:t xml:space="preserve">Martabe work instruction 'Sampling Raw and Filtrat Water' DOC-3-MET-PRS-WIN-00063-IE v1.0 (issued 25/12/2024) - Part B sampling technique</w:t>
       </w:r>
     </w:p>
     <w:sectPr>

</xml_diff>